<commit_message>
Quality review bilingual reference revisions and distinguish changed tasks from scoring errors
</commit_message>
<xml_diff>
--- a/revisions/reviewer_2_20261030/manuscript_tracked.docx
+++ b/revisions/reviewer_2_20261030/manuscript_tracked.docx
@@ -4583,9 +4583,9 @@
     </w:p>
     <w:p>
       <w:pPr/>
-      <w:ins w:id="2900000" w:author="Manuscript revision" w:date="2026-10-22T10:00:00Z">
-        <w:r>
-          <w:t xml:space="preserve">The dependency review covered all 46 replacement drafts (23 bilingual pairs). Twelve pairs were supported within their stated scope, nine required scope qualifications, and two had new correction proposals. The August 2026 Anvisa FAQ distinguishes direct site import of lab kits from the preapproval distribution restriction on investigational medicines; a 2026 biosimilar note also exempts development limited to comparative pharmacokinetic relative-bioavailability studies from DDCM submission. These findings require separate bilingual question/reference revisions for DR8_DIRECT_06 and DR8BIO_DIRECT_20. Filing-date transitions, category-specific rules, separate sponsor and institutional duties, and current foreign-authority and filing guidance were documented in supplementary audit S30. These are AI-assisted desk-review dispositions, not human-adjudicated error rates or exhaustive current-law certification. Proposed gold revisions remain unapproved, and no corrected accuracy is reported.</w:t>
+      <w:ins w:id="3100000" w:author="Manuscript revision" w:date="2026-10-22T10:00:00Z">
+        <w:r>
+          <w:t xml:space="preserve">The dependency review covered all 46 replacement drafts (23 bilingual pairs). Twelve pairs were supported within their stated scope, nine required qualifications, and two generated revised-task proposals. A subsequent AI quality review checked eight revised rows across four pairs against the cited provisions, conditions and Portuguese–English wording. It restricted the lab-kit exception to participant screening and made preservative-efficacy wording conditional. Three pairs change question scope, including adding the PK-only biosimilar DDCM exception to a question originally limited to Articles 2–3; these changes are not retrospective proof of scoring errors in the original tasks. A separate inactive working collection contains 50 rows. Supplementary audits S30 and S31 document the findings and versions. This is AI review, not human verification or independent validation, and no corrected accuracy is reported.</w:t>
         </w:r>
       </w:ins>
     </w:p>

</xml_diff>

<commit_message>
Explain partial-answer findings and distinguish observed failures from hypotheses
</commit_message>
<xml_diff>
--- a/revisions/reviewer_2_20261030/manuscript_tracked.docx
+++ b/revisions/reviewer_2_20261030/manuscript_tracked.docx
@@ -9727,13 +9727,13 @@
     <w:p/>
     <w:p/>
     <w:p>
-      <w:ins w:id="7000002" w:author="Manuscript revision" w:date="2026-10-30T22:16:17.387864+00:00">
-        <w:r>
-          <w:rPr>
-            <w:rFonts w:ascii="Arial" w:hAnsi="Arial" w:eastAsia="Arial" w:cs="Arial"/>
-            <w:color w:val="000000"/>
-          </w:rPr>
-          <w:t xml:space="preserve">The exploratory partial-answer prompt comparison improved delivery of some supported information but retained passage gaps and introduced undesirable answer behavior. Its one-repeat, unblinded AI-assisted inspection cannot replace human validation, and its selected subset results do not change the original 10/20 author-reviewed pair outcome. No revised prompt was deployed from this diagnostic.</w:t>
+      <w:ins w:id="8000000" w:author="Manuscript revision" w:date="2026-10-30T22:34:15.446305+00:00">
+        <w:r>
+          <w:rPr>
+            <w:rFonts w:ascii="Arial" w:hAnsi="Arial" w:eastAsia="Arial" w:cs="Arial"/>
+            <w:color w:val="000000"/>
+          </w:rPr>
+          <w:t xml:space="preserve">The exploratory prompt comparison supports the blanket-refusal policy as one contributor to omitted supported information: with identical passages, AI-assisted inspection found coverage of all available requested content in 1/5 eligible partly answerable outputs under the original prompt and 5/5 under the revision. It does not establish that instruction wording alone explains the failures. Required clauses remained absent, limiting full-task partly answerable success to 1/4 bilingual pairs under the revision. Permitting partial answers also produced related but unrequested content, including a Risk Minimization Plan instead of a contingency plan and an API definition instead of dossier requirements. These cases suggest that source support and relevance to the exact requested task need separate checks. Portuguese answers to English questions and citations appended to blanket refusals show additional instruction-compliance failures. Influence of Portuguese source text on response language is a possible explanation, not an isolated experimental finding. The original prompt itself produced one useful partial answer, demonstrating that the refusal instruction did not determine every output. One generation per condition, changed prompt wording and length, and unblinded AI-assisted inspection leave stochastic variation and interacting instructions unresolved. The diagnostic supports a mixed, limited explanation; it does not establish a reliable repair or change the original 10/20 human-reviewed result. No revised prompt was deployed.</w:t>
         </w:r>
       </w:ins>
     </w:p>

</xml_diff>

<commit_message>
Document controlled partial-answer mechanisms and negative results from 213 generations
</commit_message>
<xml_diff>
--- a/revisions/reviewer_2_20261030/manuscript_tracked.docx
+++ b/revisions/reviewer_2_20261030/manuscript_tracked.docx
@@ -9727,13 +9727,13 @@
     <w:p/>
     <w:p/>
     <w:p>
-      <w:ins w:id="8000000" w:author="Manuscript revision" w:date="2026-10-30T22:34:15.446305+00:00">
-        <w:r>
-          <w:rPr>
-            <w:rFonts w:ascii="Arial" w:hAnsi="Arial" w:eastAsia="Arial" w:cs="Arial"/>
-            <w:color w:val="000000"/>
-          </w:rPr>
-          <w:t xml:space="preserve">The exploratory prompt comparison supports the blanket-refusal policy as one contributor to omitted supported information: with identical passages, AI-assisted inspection found coverage of all available requested content in 1/5 eligible partly answerable outputs under the original prompt and 5/5 under the revision. It does not establish that instruction wording alone explains the failures. Required clauses remained absent, limiting full-task partly answerable success to 1/4 bilingual pairs under the revision. Permitting partial answers also produced related but unrequested content, including a Risk Minimization Plan instead of a contingency plan and an API definition instead of dossier requirements. These cases suggest that source support and relevance to the exact requested task need separate checks. Portuguese answers to English questions and citations appended to blanket refusals show additional instruction-compliance failures. Influence of Portuguese source text on response language is a possible explanation, not an isolated experimental finding. The original prompt itself produced one useful partial answer, demonstrating that the refusal instruction did not determine every output. One generation per condition, changed prompt wording and length, and unblinded AI-assisted inspection leave stochastic variation and interacting instructions unresolved. The diagnostic supports a mixed, limited explanation; it does not establish a reliable repair or change the original 10/20 human-reviewed result. No revised prompt was deployed.</w:t>
+      <w:ins w:id="9000000" w:author="Manuscript revision" w:date="2026-10-31T08:25:19.939237+00:00">
+        <w:r>
+          <w:rPr>
+            <w:rFonts w:ascii="Arial" w:hAnsi="Arial" w:eastAsia="Arial" w:cs="Arial"/>
+            <w:color w:val="000000"/>
+          </w:rPr>
+          <w:t xml:space="preserve">A controlled development follow-up used 213 unique generations with three repeats per fixed condition, no external judge, and local unblinded AI-assisted inspection (Supplementary S34). For AV_015, both languages, the original policy refused in 6/6 saved-context responses, whereas the revised policy provided supported update triggers and electronic submission while identifying the absent deadline in 6/6; unrelated appended text reproduced this contrast. For AV_014, direct clauses recovered the literature-evidence requirement in 6/6 revised responses, compared with canonical refusals in 6/6 saved and 6/6 length-control responses. This was component recovery, not full-task success. For AV_008 English, all 18 responses with direct Article 9 evidence answered the contingency-plan task despite related or unrelated appended passages; all six without Article 9 discussed the Risk Minimization Plan, including three with a relevance reminder. An explicit refusal branch reduced cited canonical refusals from 8/9 to 0/9 on three selected questions. All 36 minimal-context language responses were English, so translation and a stronger language reminder showed no incremental benefit. Identical prompts still varied in response language and refusal behavior. Missing clauses and refusal policy contributed to these selected failures, but neither explains every error. Source-language effects in complex contexts, interactions between instructions, and generalization remain unresolved. These development tests do not establish a reliable repair or change the original 10/20 human-reviewed bilingual-pair result. No revised prompt was deployed.</w:t>
         </w:r>
       </w:ins>
     </w:p>

</xml_diff>